<commit_message>
Incendio: plantas del HSST (planta baja y alta); ayuda y manual de referentes HSST actualizados
Co-Authored-By: Claude Opus 5.5 <noreply@anthropic.com>
Claude-Session: https://claude.ai/code/session_012SCdV5DZQ9e1ndgDB1c9RA
</commit_message>
<xml_diff>
--- a/manuales/Manual_Referentes_HSST_Mi_establecimiento_v0.docx
+++ b/manuales/Manual_Referentes_HSST_Mi_establecimiento_v0.docx
@@ -5335,6 +5335,37 @@
             <w:r>
               <w:rPr>
                 <w:rFonts w:ascii="Plus Jakarta Sans" w:cs="Plus Jakarta Sans" w:eastAsia="Plus Jakarta Sans" w:hAnsi="Plus Jakarta Sans"/>
+                <w:b/>
+                <w:bCs/>
+                <w:color w:val="343A40"/>
+                <w:sz w:val="20"/>
+                <w:szCs w:val="20"/>
+              </w:rPr>
+              <w:t xml:space="preserve">Planta</w:t>
+            </w:r>
+            <w:r>
+              <w:rPr>
+                <w:rFonts w:ascii="Plus Jakarta Sans" w:cs="Plus Jakarta Sans" w:eastAsia="Plus Jakarta Sans" w:hAnsi="Plus Jakarta Sans"/>
+                <w:color w:val="4A5157"/>
+                <w:sz w:val="20"/>
+                <w:szCs w:val="20"/>
+              </w:rPr>
+              <w:t xml:space="preserve">: Planta baja o Planta alta.</w:t>
+            </w:r>
+          </w:p>
+          <w:p>
+            <w:pPr>
+              <w:pStyle w:val="ListParagraph"/>
+              <w:numPr>
+                <w:ilvl w:val="0"/>
+                <w:numId w:val="2"/>
+              </w:numPr>
+              <w:spacing w:after="40" w:line="300"/>
+              <w:jc w:val="both"/>
+            </w:pPr>
+            <w:r>
+              <w:rPr>
+                <w:rFonts w:ascii="Plus Jakarta Sans" w:cs="Plus Jakarta Sans" w:eastAsia="Plus Jakarta Sans" w:hAnsi="Plus Jakarta Sans"/>
                 <w:color w:val="4A5157"/>
                 <w:sz w:val="20"/>
                 <w:szCs w:val="20"/>
@@ -5409,7 +5440,7 @@
       <w:r>
         <w:drawing>
           <wp:inline distT="0" distB="0" distL="0" distR="0">
-            <wp:extent cx="4953000" cy="2628900"/>
+            <wp:extent cx="4953000" cy="1466850"/>
             <wp:effectExtent t="19050" r="19050" b="19050" l="19050"/>
             <wp:docPr id="14" name="" descr="" title=""/>
             <wp:cNvGraphicFramePr>
@@ -5434,7 +5465,7 @@
                   <pic:spPr bwMode="auto">
                     <a:xfrm>
                       <a:off x="0" y="0"/>
-                      <a:ext cx="4953000" cy="2628900"/>
+                      <a:ext cx="4953000" cy="1466850"/>
                     </a:xfrm>
                     <a:prstGeom prst="rect">
                       <a:avLst/>
@@ -5467,7 +5498,7 @@
           <w:sz w:val="16"/>
           <w:szCs w:val="16"/>
         </w:rPr>
-        <w:t xml:space="preserve">Agregar un extintor: N.º de puesto y planta.</w:t>
+        <w:t xml:space="preserve">Agregar un extintor: el N.º de puesto es el del cartel. Después se elige la planta (planta baja o alta).</w:t>
       </w:r>
     </w:p>
     <w:p>

</xml_diff>

<commit_message>
Manual referentes HSST: desvíos dentro de Mi establecimiento
Co-Authored-By: Claude Opus 5.5 <noreply@anthropic.com>
Claude-Session: https://claude.ai/code/session_012SCdV5DZQ9e1ndgDB1c9RA
</commit_message>
<xml_diff>
--- a/manuales/Manual_Referentes_HSST_Mi_establecimiento_v0.docx
+++ b/manuales/Manual_Referentes_HSST_Mi_establecimiento_v0.docx
@@ -2307,7 +2307,7 @@
           <w:sz w:val="20"/>
           <w:szCs w:val="20"/>
         </w:rPr>
-        <w:t xml:space="preserve">. Se abre la página de carga del HSST.</w:t>
+        <w:t xml:space="preserve">. La carga se abre dentro de la misma pantalla y ya sabe quién sos: no hay que elegir el nombre ni poner el DNI.</w:t>
       </w:r>
     </w:p>
     <w:p>
@@ -2327,67 +2327,27 @@
           <w:sz w:val="20"/>
           <w:szCs w:val="20"/>
         </w:rPr>
-        <w:t xml:space="preserve">La primera vez elegí tu nombre (</w:t>
-      </w:r>
-      <w:r>
-        <w:rPr>
-          <w:rFonts w:ascii="Plus Jakarta Sans" w:cs="Plus Jakarta Sans" w:eastAsia="Plus Jakarta Sans" w:hAnsi="Plus Jakarta Sans"/>
-          <w:b/>
-          <w:bCs/>
-          <w:color w:val="343A40"/>
-          <w:sz w:val="20"/>
-          <w:szCs w:val="20"/>
-        </w:rPr>
-        <w:t xml:space="preserve">Funez</w:t>
-      </w:r>
-      <w:r>
-        <w:rPr>
-          <w:rFonts w:ascii="Plus Jakarta Sans" w:cs="Plus Jakarta Sans" w:eastAsia="Plus Jakarta Sans" w:hAnsi="Plus Jakarta Sans"/>
-          <w:color w:val="4A5157"/>
-          <w:sz w:val="20"/>
-          <w:szCs w:val="20"/>
-        </w:rPr>
-        <w:t xml:space="preserve"> o </w:t>
-      </w:r>
-      <w:r>
-        <w:rPr>
-          <w:rFonts w:ascii="Plus Jakarta Sans" w:cs="Plus Jakarta Sans" w:eastAsia="Plus Jakarta Sans" w:hAnsi="Plus Jakarta Sans"/>
-          <w:b/>
-          <w:bCs/>
-          <w:color w:val="343A40"/>
-          <w:sz w:val="20"/>
-          <w:szCs w:val="20"/>
-        </w:rPr>
-        <w:t xml:space="preserve">Hellriegel</w:t>
-      </w:r>
-      <w:r>
-        <w:rPr>
-          <w:rFonts w:ascii="Plus Jakarta Sans" w:cs="Plus Jakarta Sans" w:eastAsia="Plus Jakarta Sans" w:hAnsi="Plus Jakarta Sans"/>
-          <w:color w:val="4A5157"/>
-          <w:sz w:val="20"/>
-          <w:szCs w:val="20"/>
-        </w:rPr>
-        <w:t xml:space="preserve">) y escribí los </w:t>
-      </w:r>
-      <w:r>
-        <w:rPr>
-          <w:rFonts w:ascii="Plus Jakarta Sans" w:cs="Plus Jakarta Sans" w:eastAsia="Plus Jakarta Sans" w:hAnsi="Plus Jakarta Sans"/>
-          <w:b/>
-          <w:bCs/>
-          <w:color w:val="343A40"/>
-          <w:sz w:val="20"/>
-          <w:szCs w:val="20"/>
-        </w:rPr>
-        <w:t xml:space="preserve">3 últimos números de tu DNI</w:t>
-      </w:r>
-      <w:r>
-        <w:rPr>
-          <w:rFonts w:ascii="Plus Jakarta Sans" w:cs="Plus Jakarta Sans" w:eastAsia="Plus Jakarta Sans" w:hAnsi="Plus Jakarta Sans"/>
-          <w:color w:val="4A5157"/>
-          <w:sz w:val="20"/>
-          <w:szCs w:val="20"/>
-        </w:rPr>
-        <w:t xml:space="preserve">. El celular lo recuerda para las próximas veces.</w:t>
+        <w:t xml:space="preserve">Elegí el </w:t>
+      </w:r>
+      <w:r>
+        <w:rPr>
+          <w:rFonts w:ascii="Plus Jakarta Sans" w:cs="Plus Jakarta Sans" w:eastAsia="Plus Jakarta Sans" w:hAnsi="Plus Jakarta Sans"/>
+          <w:b/>
+          <w:bCs/>
+          <w:color w:val="343A40"/>
+          <w:sz w:val="20"/>
+          <w:szCs w:val="20"/>
+        </w:rPr>
+        <w:t xml:space="preserve">lugar</w:t>
+      </w:r>
+      <w:r>
+        <w:rPr>
+          <w:rFonts w:ascii="Plus Jakarta Sans" w:cs="Plus Jakarta Sans" w:eastAsia="Plus Jakarta Sans" w:hAnsi="Plus Jakarta Sans"/>
+          <w:color w:val="4A5157"/>
+          <w:sz w:val="20"/>
+          <w:szCs w:val="20"/>
+        </w:rPr>
+        <w:t xml:space="preserve">: un servicio de internación (Terapia, Clínica Médica, Maternidad, Pediatría), otro servicio (consultorios, guardia, rayos X, laboratorio, esterilización, anatomía patológica) o un CAPS.</w:t>
       </w:r>
     </w:p>
     <w:p>
@@ -2407,27 +2367,27 @@
           <w:sz w:val="20"/>
           <w:szCs w:val="20"/>
         </w:rPr>
-        <w:t xml:space="preserve">Elegí el </w:t>
-      </w:r>
-      <w:r>
-        <w:rPr>
-          <w:rFonts w:ascii="Plus Jakarta Sans" w:cs="Plus Jakarta Sans" w:eastAsia="Plus Jakarta Sans" w:hAnsi="Plus Jakarta Sans"/>
-          <w:b/>
-          <w:bCs/>
-          <w:color w:val="343A40"/>
-          <w:sz w:val="20"/>
-          <w:szCs w:val="20"/>
-        </w:rPr>
-        <w:t xml:space="preserve">lugar</w:t>
-      </w:r>
-      <w:r>
-        <w:rPr>
-          <w:rFonts w:ascii="Plus Jakarta Sans" w:cs="Plus Jakarta Sans" w:eastAsia="Plus Jakarta Sans" w:hAnsi="Plus Jakarta Sans"/>
-          <w:color w:val="4A5157"/>
-          <w:sz w:val="20"/>
-          <w:szCs w:val="20"/>
-        </w:rPr>
-        <w:t xml:space="preserve">: un servicio de internación (Terapia, Clínica Médica, Maternidad, Pediatría), otro servicio (consultorios, guardia, rayos X, laboratorio, esterilización, anatomía patológica) o un CAPS.</w:t>
+        <w:t xml:space="preserve">Marcá </w:t>
+      </w:r>
+      <w:r>
+        <w:rPr>
+          <w:rFonts w:ascii="Plus Jakarta Sans" w:cs="Plus Jakarta Sans" w:eastAsia="Plus Jakarta Sans" w:hAnsi="Plus Jakarta Sans"/>
+          <w:b/>
+          <w:bCs/>
+          <w:color w:val="343A40"/>
+          <w:sz w:val="20"/>
+          <w:szCs w:val="20"/>
+        </w:rPr>
+        <w:t xml:space="preserve">qué viste</w:t>
+      </w:r>
+      <w:r>
+        <w:rPr>
+          <w:rFonts w:ascii="Plus Jakarta Sans" w:cs="Plus Jakarta Sans" w:eastAsia="Plus Jakarta Sans" w:hAnsi="Plus Jakarta Sans"/>
+          <w:color w:val="4A5157"/>
+          <w:sz w:val="20"/>
+          <w:szCs w:val="20"/>
+        </w:rPr>
+        <w:t xml:space="preserve"> (se puede marcar más de una cosa) y agregá un detalle si hace falta.</w:t>
       </w:r>
     </w:p>
     <w:p>
@@ -2447,46 +2407,6 @@
           <w:sz w:val="20"/>
           <w:szCs w:val="20"/>
         </w:rPr>
-        <w:t xml:space="preserve">Marcá </w:t>
-      </w:r>
-      <w:r>
-        <w:rPr>
-          <w:rFonts w:ascii="Plus Jakarta Sans" w:cs="Plus Jakarta Sans" w:eastAsia="Plus Jakarta Sans" w:hAnsi="Plus Jakarta Sans"/>
-          <w:b/>
-          <w:bCs/>
-          <w:color w:val="343A40"/>
-          <w:sz w:val="20"/>
-          <w:szCs w:val="20"/>
-        </w:rPr>
-        <w:t xml:space="preserve">qué viste</w:t>
-      </w:r>
-      <w:r>
-        <w:rPr>
-          <w:rFonts w:ascii="Plus Jakarta Sans" w:cs="Plus Jakarta Sans" w:eastAsia="Plus Jakarta Sans" w:hAnsi="Plus Jakarta Sans"/>
-          <w:color w:val="4A5157"/>
-          <w:sz w:val="20"/>
-          <w:szCs w:val="20"/>
-        </w:rPr>
-        <w:t xml:space="preserve"> (se puede marcar más de una cosa) y agregá un detalle si hace falta.</w:t>
-      </w:r>
-    </w:p>
-    <w:p>
-      <w:pPr>
-        <w:pStyle w:val="ListParagraph"/>
-        <w:numPr>
-          <w:ilvl w:val="0"/>
-          <w:numId w:val="2"/>
-        </w:numPr>
-        <w:spacing w:after="40" w:line="300"/>
-        <w:jc w:val="both"/>
-      </w:pPr>
-      <w:r>
-        <w:rPr>
-          <w:rFonts w:ascii="Plus Jakarta Sans" w:cs="Plus Jakarta Sans" w:eastAsia="Plus Jakarta Sans" w:hAnsi="Plus Jakarta Sans"/>
-          <w:color w:val="4A5157"/>
-          <w:sz w:val="20"/>
-          <w:szCs w:val="20"/>
-        </w:rPr>
         <w:t xml:space="preserve">Sacá o subí </w:t>
       </w:r>
       <w:r>
@@ -2554,7 +2474,7 @@
       <w:r>
         <w:drawing>
           <wp:inline distT="0" distB="0" distL="0" distR="0">
-            <wp:extent cx="4953000" cy="2628900"/>
+            <wp:extent cx="4953000" cy="2895600"/>
             <wp:effectExtent t="19050" r="19050" b="19050" l="19050"/>
             <wp:docPr id="6" name="" descr="" title=""/>
             <wp:cNvGraphicFramePr>
@@ -2579,7 +2499,7 @@
                   <pic:spPr bwMode="auto">
                     <a:xfrm>
                       <a:off x="0" y="0"/>
-                      <a:ext cx="4953000" cy="2628900"/>
+                      <a:ext cx="4953000" cy="2895600"/>
                     </a:xfrm>
                     <a:prstGeom prst="rect">
                       <a:avLst/>
@@ -2612,7 +2532,7 @@
           <w:sz w:val="16"/>
           <w:szCs w:val="16"/>
         </w:rPr>
-        <w:t xml:space="preserve">Página de carga de desvíos: la primera vez, nombre y 3 últimos números del DNI.</w:t>
+        <w:t xml:space="preserve">Cargar un desvío, dentro de «Mi establecimiento»: primero, dónde.</w:t>
       </w:r>
     </w:p>
     <w:p>

</xml_diff>